<commit_message>
Ajoute la section Google Ads avance : Discovery, ROAS par payout, Pmax
Nouvelle sous-section 4.4 : distinction campagne Discovery (CPA Cible
pilote) vs campagne zoom (Exact Match), choix du ROAS Cible plutot que
CPA Cible pour tenir compte du payout par GEO, calcul du bid a partir
du payout (exemple payout 75% / ROAS cible 100%), strategie Pmax
(optimiser CPA puis valeur de conversion), et la distinction entre les
donnees natives Pmax (asset groups, signaux d'audience, page feed) et
les imports CSV externes (offline conversion import, customer match).
Complete aussi le glossaire (ROAS, Payout, Pmax, GCLID, etc.) et les
astuces de la ligne "Lancement Google Ads" du tableau maitre.

Co-Authored-By: Claude Sonnet 5 <noreply@anthropic.com>
Claude-Session: https://claude.ai/code/session_01BUz7CREBadJupQZQ9qYsXT
</commit_message>
<xml_diff>
--- a/livrables/Feuille_de_route_Ad_Arbitrage.docx
+++ b/livrables/Feuille_de_route_Ad_Arbitrage.docx
@@ -96,7 +96,7 @@
           <w:sz w:val="18"/>
           <w:szCs w:val="18"/>
         </w:rPr>
-        <w:t xml:space="preserve">17 septembre 2026</w:t>
+        <w:t xml:space="preserve">18 septembre 2026</w:t>
       </w:r>
     </w:p>
     <w:p>
@@ -2038,6 +2038,45 @@
               <w:t xml:space="preserve">› Value-based bidding : faire remonter la valeur réelle (RPM display + commission affiliation) via GTM/GA4.</w:t>
             </w:r>
           </w:p>
+          <w:p>
+            <w:pPr>
+              <w:spacing w:after="30" w:line="250"/>
+            </w:pPr>
+            <w:r>
+              <w:rPr>
+                <w:color w:val="222222"/>
+                <w:sz w:val="17"/>
+                <w:szCs w:val="17"/>
+              </w:rPr>
+              <w:t xml:space="preserve">› Distinguer 2 campagnes : Discovery en CPA Cible (piloté manuellement) vs zoom Search en Exact Match.</w:t>
+            </w:r>
+          </w:p>
+          <w:p>
+            <w:pPr>
+              <w:spacing w:after="30" w:line="250"/>
+            </w:pPr>
+            <w:r>
+              <w:rPr>
+                <w:color w:val="222222"/>
+                <w:sz w:val="17"/>
+                <w:szCs w:val="17"/>
+              </w:rPr>
+              <w:t xml:space="preserve">› Préférer le ROAS Cible au CPA Cible dès que plusieurs GEO sont actives : le bid part du payout par géo, pas d'un coût fixe (détail en §4.4).</w:t>
+            </w:r>
+          </w:p>
+          <w:p>
+            <w:pPr>
+              <w:spacing w:after="30" w:line="250"/>
+            </w:pPr>
+            <w:r>
+              <w:rPr>
+                <w:color w:val="222222"/>
+                <w:sz w:val="17"/>
+                <w:szCs w:val="17"/>
+              </w:rPr>
+              <w:t xml:space="preserve">› Pmax : démarrer en optimisation CPA, puis basculer sur l'optimisation valeur de conversion une fois l'historique suffisant.</w:t>
+            </w:r>
+          </w:p>
         </w:tc>
       </w:tr>
       <w:tr>
@@ -3814,6 +3853,489 @@
         <w:t xml:space="preserve">Value-based bidding : transmettre la valeur réelle du visiteur (RPM display estimé + commission affiliation) et non un simple événement binaire, pour que l'algorithme optimise sur la marge et pas seulement sur le volume.</w:t>
       </w:r>
     </w:p>
+    <w:p>
+      <w:r>
+        <w:br w:type="page"/>
+      </w:r>
+    </w:p>
+    <w:p>
+      <w:pPr>
+        <w:pStyle w:val="Heading2"/>
+        <w:spacing w:after="160" w:before="360"/>
+      </w:pPr>
+      <w:r>
+        <w:rPr>
+          <w:b/>
+          <w:bCs/>
+          <w:color w:val="13233F"/>
+          <w:sz w:val="25"/>
+          <w:szCs w:val="25"/>
+        </w:rPr>
+        <w:t xml:space="preserve">4.4 Google Ads avancé — Discovery, zoom Exact Match &amp; Performance Max</w:t>
+      </w:r>
+    </w:p>
+    <w:p>
+      <w:pPr>
+        <w:pStyle w:val="Heading3"/>
+        <w:spacing w:after="120" w:before="240"/>
+      </w:pPr>
+      <w:r>
+        <w:rPr>
+          <w:b/>
+          <w:bCs/>
+          <w:color w:val="13233F"/>
+          <w:sz w:val="22"/>
+          <w:szCs w:val="22"/>
+        </w:rPr>
+        <w:t xml:space="preserve">4.4.1 Distinguer deux campagnes</w:t>
+      </w:r>
+    </w:p>
+    <w:p>
+      <w:pPr>
+        <w:pStyle w:val="ListParagraph"/>
+        <w:numPr>
+          <w:ilvl w:val="0"/>
+          <w:numId w:val="3"/>
+        </w:numPr>
+        <w:spacing w:after="90" w:line="280"/>
+      </w:pPr>
+      <w:r>
+        <w:rPr>
+          <w:b/>
+          <w:bCs/>
+          <w:color w:val="13233F"/>
+          <w:sz w:val="21"/>
+          <w:szCs w:val="21"/>
+        </w:rPr>
+        <w:t xml:space="preserve">Discovery (découverte, large) — </w:t>
+      </w:r>
+      <w:r>
+        <w:rPr>
+          <w:color w:val="222222"/>
+          <w:sz w:val="21"/>
+          <w:szCs w:val="21"/>
+        </w:rPr>
+        <w:t xml:space="preserve">ciblage automatique et audiences larges. Piloté en CPA Cible (Target CPA) : on fixe un coût par acquisition objectif et on ajuste manuellement au fil des données (enchère, audiences, exclusions).</w:t>
+      </w:r>
+    </w:p>
+    <w:p>
+      <w:pPr>
+        <w:pStyle w:val="ListParagraph"/>
+        <w:numPr>
+          <w:ilvl w:val="0"/>
+          <w:numId w:val="3"/>
+        </w:numPr>
+        <w:spacing w:after="90" w:line="280"/>
+      </w:pPr>
+      <w:r>
+        <w:rPr>
+          <w:b/>
+          <w:bCs/>
+          <w:color w:val="13233F"/>
+          <w:sz w:val="21"/>
+          <w:szCs w:val="21"/>
+        </w:rPr>
+        <w:t xml:space="preserve">Zoom Search (recherche précise) — </w:t>
+      </w:r>
+      <w:r>
+        <w:rPr>
+          <w:color w:val="222222"/>
+          <w:sz w:val="21"/>
+          <w:szCs w:val="21"/>
+        </w:rPr>
+        <w:t xml:space="preserve">mots-clés en Exact Match uniquement — on descend sur l'intention la plus qualifiée déjà identifiée, sans dilution par des variantes larges.</w:t>
+      </w:r>
+    </w:p>
+    <w:p>
+      <w:pPr>
+        <w:spacing w:after="160" w:line="300"/>
+      </w:pPr>
+      <w:r>
+        <w:rPr>
+          <w:i/>
+          <w:iCs/>
+          <w:color w:val="5B6470"/>
+          <w:sz w:val="21"/>
+          <w:szCs w:val="21"/>
+        </w:rPr>
+        <w:t xml:space="preserve">Le principe rejoint le « Zoom » de la section 5.2 : Discovery sert à découvrir/élargir, la campagne Exact Match sert à concentrer le budget sur ce qui convertit déjà.</w:t>
+      </w:r>
+    </w:p>
+    <w:p>
+      <w:pPr>
+        <w:pStyle w:val="Heading3"/>
+        <w:spacing w:after="120" w:before="240"/>
+      </w:pPr>
+      <w:r>
+        <w:rPr>
+          <w:b/>
+          <w:bCs/>
+          <w:color w:val="13233F"/>
+          <w:sz w:val="22"/>
+          <w:szCs w:val="22"/>
+        </w:rPr>
+        <w:t xml:space="preserve">4.4.2 Choisir la stratégie d'enchère : ROAS plutôt que CPA</w:t>
+      </w:r>
+    </w:p>
+    <w:p>
+      <w:pPr>
+        <w:spacing w:after="160" w:line="300"/>
+      </w:pPr>
+      <w:r>
+        <w:rPr>
+          <w:color w:val="222222"/>
+          <w:sz w:val="21"/>
+          <w:szCs w:val="21"/>
+        </w:rPr>
+        <w:t xml:space="preserve">Dès que la campagne touche plusieurs GEO, préférer le ROAS Cible (Target ROAS) au CPA Cible. Un CPA cible fixe un coût par conversion unique, alors que le payout d'une offre affiliée varie d'un pays à l'autre : le ROAS s'adapte automatiquement à la valeur réelle de chaque conversion remontée, GEO par GEO.</w:t>
+      </w:r>
+    </w:p>
+    <w:p>
+      <w:pPr>
+        <w:pStyle w:val="ListParagraph"/>
+        <w:numPr>
+          <w:ilvl w:val="0"/>
+          <w:numId w:val="3"/>
+        </w:numPr>
+        <w:spacing w:after="90" w:line="280"/>
+      </w:pPr>
+      <w:r>
+        <w:rPr>
+          <w:b/>
+          <w:bCs/>
+          <w:color w:val="13233F"/>
+          <w:sz w:val="21"/>
+          <w:szCs w:val="21"/>
+        </w:rPr>
+        <w:t xml:space="preserve">Le BID part du payout — </w:t>
+      </w:r>
+      <w:r>
+        <w:rPr>
+          <w:color w:val="222222"/>
+          <w:sz w:val="21"/>
+          <w:szCs w:val="21"/>
+        </w:rPr>
+        <w:t xml:space="preserve">on ne fixe pas une enchère au hasard : elle se calcule à partir du payout réel de l'offre (la commission versée par conversion), remonté via GTM/postback vers Google Ads comme valeur de conversion.</w:t>
+      </w:r>
+    </w:p>
+    <w:tbl>
+      <w:tblPr>
+        <w:tblW w:type="pct" w:w="100%"/>
+        <w:tblBorders>
+          <w:top w:val="single" w:color="137CF0" w:sz="4"/>
+          <w:left w:val="single" w:color="137CF0" w:sz="24"/>
+          <w:bottom w:val="single" w:color="137CF0" w:sz="4"/>
+          <w:right w:val="single" w:color="137CF0" w:sz="4"/>
+          <w:insideH w:val="single" w:color="auto" w:sz="4"/>
+          <w:insideV w:val="single" w:color="auto" w:sz="4"/>
+        </w:tblBorders>
+      </w:tblPr>
+      <w:tblGrid>
+        <w:gridCol w:w="100"/>
+      </w:tblGrid>
+      <w:tr>
+        <w:tc>
+          <w:tcPr>
+            <w:shd w:fill="EAF2FE" w:val="clear"/>
+            <w:tcMar>
+              <w:top w:type="dxa" w:w="160"/>
+              <w:left w:type="dxa" w:w="220"/>
+              <w:bottom w:type="dxa" w:w="160"/>
+              <w:right w:type="dxa" w:w="220"/>
+            </w:tcMar>
+          </w:tcPr>
+          <w:p>
+            <w:pPr>
+              <w:spacing w:after="80"/>
+            </w:pPr>
+            <w:r>
+              <w:rPr>
+                <w:b/>
+                <w:bCs/>
+                <w:color w:val="137CF0"/>
+                <w:sz w:val="21"/>
+                <w:szCs w:val="21"/>
+              </w:rPr>
+              <w:t xml:space="preserve">Exemple de calcul</w:t>
+            </w:r>
+          </w:p>
+          <w:p>
+            <w:pPr>
+              <w:spacing w:after="40" w:line="270"/>
+            </w:pPr>
+            <w:r>
+              <w:rPr>
+                <w:color w:val="333333"/>
+                <w:sz w:val="20"/>
+                <w:szCs w:val="20"/>
+              </w:rPr>
+              <w:t xml:space="preserve">• Payout (commission reçue par conversion) : 75 % de la valeur de la vente/du lead.</w:t>
+            </w:r>
+          </w:p>
+          <w:p>
+            <w:pPr>
+              <w:spacing w:after="40" w:line="270"/>
+            </w:pPr>
+            <w:r>
+              <w:rPr>
+                <w:color w:val="333333"/>
+                <w:sz w:val="20"/>
+                <w:szCs w:val="20"/>
+              </w:rPr>
+              <w:t xml:space="preserve">• ROAS Cible : 100 % — seuil de rentabilité (dépense publicitaire = revenu généré).</w:t>
+            </w:r>
+          </w:p>
+          <w:p>
+            <w:pPr>
+              <w:spacing w:after="40" w:line="270"/>
+            </w:pPr>
+            <w:r>
+              <w:rPr>
+                <w:color w:val="333333"/>
+                <w:sz w:val="20"/>
+                <w:szCs w:val="20"/>
+              </w:rPr>
+              <w:t xml:space="preserve">• L'enchère effective de Google Ads s'ajuste automatiquement pour que le rapport revenu/dépense tende vers ce ROAS cible, GEO par GEO, à partir des valeurs de conversion réellement transmises.</w:t>
+            </w:r>
+          </w:p>
+        </w:tc>
+      </w:tr>
+    </w:tbl>
+    <w:p>
+      <w:pPr>
+        <w:pStyle w:val="Heading3"/>
+        <w:spacing w:after="120" w:before="240"/>
+      </w:pPr>
+      <w:r>
+        <w:rPr>
+          <w:b/>
+          <w:bCs/>
+          <w:color w:val="13233F"/>
+          <w:sz w:val="22"/>
+          <w:szCs w:val="22"/>
+        </w:rPr>
+        <w:t xml:space="preserve">4.4.3 Performance Max (Pmax) : CPA d'abord, valeur ensuite</w:t>
+      </w:r>
+    </w:p>
+    <w:p>
+      <w:pPr>
+        <w:pStyle w:val="ListParagraph"/>
+        <w:numPr>
+          <w:ilvl w:val="0"/>
+          <w:numId w:val="2"/>
+        </w:numPr>
+        <w:spacing w:after="90" w:line="280"/>
+      </w:pPr>
+      <w:r>
+        <w:rPr>
+          <w:color w:val="222222"/>
+          <w:sz w:val="21"/>
+          <w:szCs w:val="21"/>
+        </w:rPr>
+        <w:t xml:space="preserve">Phase de démarrage — optimiser sur le CPA (Maximiser les conversions / CPA cible) tant que le volume de conversions est encore faible : ça laisse l'algorithme apprendre sur du volume plutôt que sur une valeur bruitée.</w:t>
+      </w:r>
+    </w:p>
+    <w:p>
+      <w:pPr>
+        <w:pStyle w:val="ListParagraph"/>
+        <w:numPr>
+          <w:ilvl w:val="0"/>
+          <w:numId w:val="2"/>
+        </w:numPr>
+        <w:spacing w:after="90" w:line="280"/>
+      </w:pPr>
+      <w:r>
+        <w:rPr>
+          <w:color w:val="222222"/>
+          <w:sz w:val="21"/>
+          <w:szCs w:val="21"/>
+        </w:rPr>
+        <w:t xml:space="preserve">Phase de maturité — une fois un historique de conversions suffisant accumulé (plusieurs semaines, volume stable), basculer vers l'optimisation sur la valeur de conversion (Maximiser la valeur de conversion / ROAS cible), pour que Pmax priorise les conversions à plus forte valeur (payout élevé, bon GEO) plutôt que le seul volume.</w:t>
+      </w:r>
+    </w:p>
+    <w:p>
+      <w:pPr>
+        <w:spacing w:after="160" w:line="300"/>
+      </w:pPr>
+      <w:r>
+        <w:rPr>
+          <w:b/>
+          <w:bCs/>
+          <w:color w:val="13233F"/>
+          <w:sz w:val="21"/>
+          <w:szCs w:val="21"/>
+        </w:rPr>
+        <w:t xml:space="preserve">Ne jamais activer le pilotage par valeur avant que les valeurs de conversion transmises soient fiables (voir 4.4.4) — sinon Pmax optimise sur du bruit.</w:t>
+      </w:r>
+    </w:p>
+    <w:p>
+      <w:pPr>
+        <w:pStyle w:val="Heading3"/>
+        <w:spacing w:after="120" w:before="240"/>
+      </w:pPr>
+      <w:r>
+        <w:rPr>
+          <w:b/>
+          <w:bCs/>
+          <w:color w:val="13233F"/>
+          <w:sz w:val="22"/>
+          <w:szCs w:val="22"/>
+        </w:rPr>
+        <w:t xml:space="preserve">4.4.4 Data Pmax vs Data CSV — ce qu'on envoie à Google</w:t>
+      </w:r>
+    </w:p>
+    <w:p>
+      <w:pPr>
+        <w:spacing w:after="160" w:line="300"/>
+      </w:pPr>
+      <w:r>
+        <w:rPr>
+          <w:color w:val="222222"/>
+          <w:sz w:val="21"/>
+          <w:szCs w:val="21"/>
+        </w:rPr>
+        <w:t xml:space="preserve">Deux flux de données distincts alimentent Google Ads, à ne pas confondre :</w:t>
+      </w:r>
+    </w:p>
+    <w:p>
+      <w:pPr>
+        <w:pStyle w:val="ListParagraph"/>
+        <w:numPr>
+          <w:ilvl w:val="0"/>
+          <w:numId w:val="3"/>
+        </w:numPr>
+        <w:spacing w:after="90" w:line="280"/>
+      </w:pPr>
+      <w:r>
+        <w:rPr>
+          <w:b/>
+          <w:bCs/>
+          <w:color w:val="13233F"/>
+          <w:sz w:val="21"/>
+          <w:szCs w:val="21"/>
+        </w:rPr>
+        <w:t xml:space="preserve">Data Pmax (données natives de la campagne) — </w:t>
+      </w:r>
+      <w:r>
+        <w:rPr>
+          <w:color w:val="222222"/>
+          <w:sz w:val="21"/>
+          <w:szCs w:val="21"/>
+        </w:rPr>
+        <w:t xml:space="preserve">groupes d'assets (textes, images, vidéos, logos), signaux d'audience (audiences existantes, données démographiques, centres d'intérêt fournis pour amorcer le ciblage) et, si besoin, un flux de pages (page feed) qui liste les URLs à pousser en priorité. Pmax combine ces éléments automatiquement sur tous les emplacements Google (Search, Display, YouTube, Discover, Gmail, Maps).</w:t>
+      </w:r>
+    </w:p>
+    <w:p>
+      <w:pPr>
+        <w:pStyle w:val="ListParagraph"/>
+        <w:numPr>
+          <w:ilvl w:val="0"/>
+          <w:numId w:val="3"/>
+        </w:numPr>
+        <w:spacing w:after="90" w:line="280"/>
+      </w:pPr>
+      <w:r>
+        <w:rPr>
+          <w:b/>
+          <w:bCs/>
+          <w:color w:val="13233F"/>
+          <w:sz w:val="21"/>
+          <w:szCs w:val="21"/>
+        </w:rPr>
+        <w:t xml:space="preserve">Data CSV (import externe, hors flux natif) — </w:t>
+      </w:r>
+      <w:r>
+        <w:rPr>
+          <w:color w:val="222222"/>
+          <w:sz w:val="21"/>
+          <w:szCs w:val="21"/>
+        </w:rPr>
+        <w:t xml:space="preserve">fichiers envoyés manuellement ou automatiquement à Google Ads : import de conversions hors ligne (Offline Conversion Import — CSV avec GCLID, date/heure du clic, valeur de conversion réelle) et Customer Match (CSV de contacts emails/téléphones hachés pour créer des signaux d'audience).</w:t>
+      </w:r>
+    </w:p>
+    <w:tbl>
+      <w:tblPr>
+        <w:tblW w:type="pct" w:w="100%"/>
+        <w:tblBorders>
+          <w:top w:val="single" w:color="B26A00" w:sz="4"/>
+          <w:left w:val="single" w:color="B26A00" w:sz="24"/>
+          <w:bottom w:val="single" w:color="B26A00" w:sz="4"/>
+          <w:right w:val="single" w:color="B26A00" w:sz="4"/>
+          <w:insideH w:val="single" w:color="auto" w:sz="4"/>
+          <w:insideV w:val="single" w:color="auto" w:sz="4"/>
+        </w:tblBorders>
+      </w:tblPr>
+      <w:tblGrid>
+        <w:gridCol w:w="100"/>
+      </w:tblGrid>
+      <w:tr>
+        <w:tc>
+          <w:tcPr>
+            <w:shd w:fill="FFF4E0" w:val="clear"/>
+            <w:tcMar>
+              <w:top w:type="dxa" w:w="160"/>
+              <w:left w:type="dxa" w:w="220"/>
+              <w:bottom w:type="dxa" w:w="160"/>
+              <w:right w:type="dxa" w:w="220"/>
+            </w:tcMar>
+          </w:tcPr>
+          <w:p>
+            <w:pPr>
+              <w:spacing w:after="80"/>
+            </w:pPr>
+            <w:r>
+              <w:rPr>
+                <w:b/>
+                <w:bCs/>
+                <w:color w:val="B26A00"/>
+                <w:sz w:val="21"/>
+                <w:szCs w:val="21"/>
+              </w:rPr>
+              <w:t xml:space="preserve">Pourquoi le CSV est essentiel en ad arbitrage</w:t>
+            </w:r>
+          </w:p>
+          <w:p>
+            <w:pPr>
+              <w:spacing w:after="40" w:line="270"/>
+            </w:pPr>
+            <w:r>
+              <w:rPr>
+                <w:color w:val="333333"/>
+                <w:sz w:val="20"/>
+                <w:szCs w:val="20"/>
+              </w:rPr>
+              <w:t xml:space="preserve">• Le payout d'une conversion affiliée n'est souvent connu/validé que plusieurs jours après le clic (délai de validation du programme).</w:t>
+            </w:r>
+          </w:p>
+          <w:p>
+            <w:pPr>
+              <w:spacing w:after="40" w:line="270"/>
+            </w:pPr>
+            <w:r>
+              <w:rPr>
+                <w:color w:val="333333"/>
+                <w:sz w:val="20"/>
+                <w:szCs w:val="20"/>
+              </w:rPr>
+              <w:t xml:space="preserve">• Le CSV d'import de conversions permet de renvoyer la valeur réelle à Google a posteriori (associée au GCLID capté au clic), pour que le bidding ROAS/valeur apprenne sur la donnée vraie plutôt que sur une estimation au moment du clic.</w:t>
+            </w:r>
+          </w:p>
+          <w:p>
+            <w:pPr>
+              <w:spacing w:after="40" w:line="270"/>
+            </w:pPr>
+            <w:r>
+              <w:rPr>
+                <w:color w:val="333333"/>
+                <w:sz w:val="20"/>
+                <w:szCs w:val="20"/>
+              </w:rPr>
+              <w:t xml:space="preserve">• Sans ce renvoi différé, la campagne optimise sur une valeur par défaut ou sur un simple volume de clics — la stratégie ROAS perd son intérêt.</w:t>
+            </w:r>
+          </w:p>
+        </w:tc>
+      </w:tr>
+    </w:tbl>
     <w:p>
       <w:r>
         <w:br w:type="page"/>
@@ -5229,6 +5751,282 @@
                 <w:szCs w:val="19"/>
               </w:rPr>
               <w:t xml:space="preserve">Audience publicitaire générée à partir des caractéristiques des meilleurs convertisseurs existants.</w:t>
+            </w:r>
+          </w:p>
+        </w:tc>
+      </w:tr>
+      <w:tr>
+        <w:tc>
+          <w:tcPr>
+            <w:tcW w:type="dxa" w:w="2400"/>
+            <w:shd w:fill="F2F3F5" w:val="clear"/>
+            <w:tcMar>
+              <w:top w:type="dxa" w:w="90"/>
+              <w:left w:type="dxa" w:w="120"/>
+              <w:bottom w:type="dxa" w:w="90"/>
+              <w:right w:type="dxa" w:w="120"/>
+            </w:tcMar>
+          </w:tcPr>
+          <w:p>
+            <w:r>
+              <w:rPr>
+                <w:b/>
+                <w:bCs/>
+                <w:color w:val="13233F"/>
+                <w:sz w:val="19"/>
+                <w:szCs w:val="19"/>
+              </w:rPr>
+              <w:t xml:space="preserve">Payout</w:t>
+            </w:r>
+          </w:p>
+        </w:tc>
+        <w:tc>
+          <w:tcPr>
+            <w:tcW w:type="dxa" w:w="8400"/>
+            <w:tcMar>
+              <w:top w:type="dxa" w:w="90"/>
+              <w:left w:type="dxa" w:w="120"/>
+              <w:bottom w:type="dxa" w:w="90"/>
+              <w:right w:type="dxa" w:w="120"/>
+            </w:tcMar>
+          </w:tcPr>
+          <w:p>
+            <w:r>
+              <w:rPr>
+                <w:sz w:val="19"/>
+                <w:szCs w:val="19"/>
+              </w:rPr>
+              <w:t xml:space="preserve">Commission versée par un programme d'affiliation pour une conversion — sert de base au calcul du bid en ROAS.</w:t>
+            </w:r>
+          </w:p>
+        </w:tc>
+      </w:tr>
+      <w:tr>
+        <w:tc>
+          <w:tcPr>
+            <w:tcW w:type="dxa" w:w="2400"/>
+            <w:shd w:fill="F2F3F5" w:val="clear"/>
+            <w:tcMar>
+              <w:top w:type="dxa" w:w="90"/>
+              <w:left w:type="dxa" w:w="120"/>
+              <w:bottom w:type="dxa" w:w="90"/>
+              <w:right w:type="dxa" w:w="120"/>
+            </w:tcMar>
+          </w:tcPr>
+          <w:p>
+            <w:r>
+              <w:rPr>
+                <w:b/>
+                <w:bCs/>
+                <w:color w:val="13233F"/>
+                <w:sz w:val="19"/>
+                <w:szCs w:val="19"/>
+              </w:rPr>
+              <w:t xml:space="preserve">ROAS</w:t>
+            </w:r>
+          </w:p>
+        </w:tc>
+        <w:tc>
+          <w:tcPr>
+            <w:tcW w:type="dxa" w:w="8400"/>
+            <w:tcMar>
+              <w:top w:type="dxa" w:w="90"/>
+              <w:left w:type="dxa" w:w="120"/>
+              <w:bottom w:type="dxa" w:w="90"/>
+              <w:right w:type="dxa" w:w="120"/>
+            </w:tcMar>
+          </w:tcPr>
+          <w:p>
+            <w:r>
+              <w:rPr>
+                <w:sz w:val="19"/>
+                <w:szCs w:val="19"/>
+              </w:rPr>
+              <w:t xml:space="preserve">Return On Ad Spend — revenu généré ÷ dépense publicitaire. Un ROAS cible de 100 % correspond au seuil de rentabilité.</w:t>
+            </w:r>
+          </w:p>
+        </w:tc>
+      </w:tr>
+      <w:tr>
+        <w:tc>
+          <w:tcPr>
+            <w:tcW w:type="dxa" w:w="2400"/>
+            <w:shd w:fill="F2F3F5" w:val="clear"/>
+            <w:tcMar>
+              <w:top w:type="dxa" w:w="90"/>
+              <w:left w:type="dxa" w:w="120"/>
+              <w:bottom w:type="dxa" w:w="90"/>
+              <w:right w:type="dxa" w:w="120"/>
+            </w:tcMar>
+          </w:tcPr>
+          <w:p>
+            <w:r>
+              <w:rPr>
+                <w:b/>
+                <w:bCs/>
+                <w:color w:val="13233F"/>
+                <w:sz w:val="19"/>
+                <w:szCs w:val="19"/>
+              </w:rPr>
+              <w:t xml:space="preserve">Pmax (Performance Max)</w:t>
+            </w:r>
+          </w:p>
+        </w:tc>
+        <w:tc>
+          <w:tcPr>
+            <w:tcW w:type="dxa" w:w="8400"/>
+            <w:tcMar>
+              <w:top w:type="dxa" w:w="90"/>
+              <w:left w:type="dxa" w:w="120"/>
+              <w:bottom w:type="dxa" w:w="90"/>
+              <w:right w:type="dxa" w:w="120"/>
+            </w:tcMar>
+          </w:tcPr>
+          <w:p>
+            <w:r>
+              <w:rPr>
+                <w:sz w:val="19"/>
+                <w:szCs w:val="19"/>
+              </w:rPr>
+              <w:t xml:space="preserve">Type de campagne Google Ads qui diffuse automatiquement sur tous les emplacements (Search, Display, YouTube, Discover, Gmail, Maps) à partir de groupes d'assets et de signaux d'audience.</w:t>
+            </w:r>
+          </w:p>
+        </w:tc>
+      </w:tr>
+      <w:tr>
+        <w:tc>
+          <w:tcPr>
+            <w:tcW w:type="dxa" w:w="2400"/>
+            <w:shd w:fill="F2F3F5" w:val="clear"/>
+            <w:tcMar>
+              <w:top w:type="dxa" w:w="90"/>
+              <w:left w:type="dxa" w:w="120"/>
+              <w:bottom w:type="dxa" w:w="90"/>
+              <w:right w:type="dxa" w:w="120"/>
+            </w:tcMar>
+          </w:tcPr>
+          <w:p>
+            <w:r>
+              <w:rPr>
+                <w:b/>
+                <w:bCs/>
+                <w:color w:val="13233F"/>
+                <w:sz w:val="19"/>
+                <w:szCs w:val="19"/>
+              </w:rPr>
+              <w:t xml:space="preserve">Offline Conversion Import</w:t>
+            </w:r>
+          </w:p>
+        </w:tc>
+        <w:tc>
+          <w:tcPr>
+            <w:tcW w:type="dxa" w:w="8400"/>
+            <w:tcMar>
+              <w:top w:type="dxa" w:w="90"/>
+              <w:left w:type="dxa" w:w="120"/>
+              <w:bottom w:type="dxa" w:w="90"/>
+              <w:right w:type="dxa" w:w="120"/>
+            </w:tcMar>
+          </w:tcPr>
+          <w:p>
+            <w:r>
+              <w:rPr>
+                <w:sz w:val="19"/>
+                <w:szCs w:val="19"/>
+              </w:rPr>
+              <w:t xml:space="preserve">Import CSV de conversions vers Google Ads, associées à un GCLID, pour transmettre a posteriori la valeur réelle d'une conversion validée en différé.</w:t>
+            </w:r>
+          </w:p>
+        </w:tc>
+      </w:tr>
+      <w:tr>
+        <w:tc>
+          <w:tcPr>
+            <w:tcW w:type="dxa" w:w="2400"/>
+            <w:shd w:fill="F2F3F5" w:val="clear"/>
+            <w:tcMar>
+              <w:top w:type="dxa" w:w="90"/>
+              <w:left w:type="dxa" w:w="120"/>
+              <w:bottom w:type="dxa" w:w="90"/>
+              <w:right w:type="dxa" w:w="120"/>
+            </w:tcMar>
+          </w:tcPr>
+          <w:p>
+            <w:r>
+              <w:rPr>
+                <w:b/>
+                <w:bCs/>
+                <w:color w:val="13233F"/>
+                <w:sz w:val="19"/>
+                <w:szCs w:val="19"/>
+              </w:rPr>
+              <w:t xml:space="preserve">Customer Match</w:t>
+            </w:r>
+          </w:p>
+        </w:tc>
+        <w:tc>
+          <w:tcPr>
+            <w:tcW w:type="dxa" w:w="8400"/>
+            <w:tcMar>
+              <w:top w:type="dxa" w:w="90"/>
+              <w:left w:type="dxa" w:w="120"/>
+              <w:bottom w:type="dxa" w:w="90"/>
+              <w:right w:type="dxa" w:w="120"/>
+            </w:tcMar>
+          </w:tcPr>
+          <w:p>
+            <w:r>
+              <w:rPr>
+                <w:sz w:val="19"/>
+                <w:szCs w:val="19"/>
+              </w:rPr>
+              <w:t xml:space="preserve">Import CSV de contacts (emails/téléphones hachés) utilisé pour créer des signaux d'audience dans Google Ads.</w:t>
+            </w:r>
+          </w:p>
+        </w:tc>
+      </w:tr>
+      <w:tr>
+        <w:tc>
+          <w:tcPr>
+            <w:tcW w:type="dxa" w:w="2400"/>
+            <w:shd w:fill="F2F3F5" w:val="clear"/>
+            <w:tcMar>
+              <w:top w:type="dxa" w:w="90"/>
+              <w:left w:type="dxa" w:w="120"/>
+              <w:bottom w:type="dxa" w:w="90"/>
+              <w:right w:type="dxa" w:w="120"/>
+            </w:tcMar>
+          </w:tcPr>
+          <w:p>
+            <w:r>
+              <w:rPr>
+                <w:b/>
+                <w:bCs/>
+                <w:color w:val="13233F"/>
+                <w:sz w:val="19"/>
+                <w:szCs w:val="19"/>
+              </w:rPr>
+              <w:t xml:space="preserve">GCLID</w:t>
+            </w:r>
+          </w:p>
+        </w:tc>
+        <w:tc>
+          <w:tcPr>
+            <w:tcW w:type="dxa" w:w="8400"/>
+            <w:tcMar>
+              <w:top w:type="dxa" w:w="90"/>
+              <w:left w:type="dxa" w:w="120"/>
+              <w:bottom w:type="dxa" w:w="90"/>
+              <w:right w:type="dxa" w:w="120"/>
+            </w:tcMar>
+          </w:tcPr>
+          <w:p>
+            <w:r>
+              <w:rPr>
+                <w:sz w:val="19"/>
+                <w:szCs w:val="19"/>
+              </w:rPr>
+              <w:t xml:space="preserve">Google Click ID — identifiant unique d'un clic sur une annonce Google, utilisé pour relier un clic à sa conversion lors d'un import hors ligne.</w:t>
             </w:r>
           </w:p>
         </w:tc>

</xml_diff>